<commit_message>
Parte B: 15 SERP Serper raccolte (EN/DE/RU), report concorrenza con giudizio, sezione 2 della review aggiornata
Co-Authored-By: Claude Opus 5.5 <noreply@anthropic.com>
Claude-Session: https://claude.ai/code/session_01LF5er3Z17t23FfAov8Jpiw
</commit_message>
<xml_diff>
--- a/reports/KALOPETRIDES_WEBSITE_REVIEW_2026-10-05.docx
+++ b/reports/KALOPETRIDES_WEBSITE_REVIEW_2026-10-05.docx
@@ -41,7 +41,15 @@
     </w:p>
     <w:p>
       <w:r>
-        <w:t>We tried to check Google's live results on 5 and 6 October 2026, but the search tool we use was not available on either day. This section therefore describes only what Google and AI assistants can find on the website itself. Google's live results will be added once the check can be run.</w:t>
+        <w:t>On 6 October 2026 we checked Google's results for five typical searches, one per service, each in English (as searched from Cyprus), German (from Germany) and Russian (from Russia): 15 searches in total, top 10 results each.</w:t>
+      </w:r>
+    </w:p>
+    <w:p>
+      <w:r>
+        <w:rPr>
+          <w:b/>
+        </w:rPr>
+        <w:t>Kalopetrides Law did not appear in any of the 15 searches.</w:t>
       </w:r>
     </w:p>
     <w:tbl>
@@ -52,14 +60,15 @@
         <w:tblLook w:firstColumn="1" w:firstRow="1" w:lastColumn="0" w:lastRow="0" w:noHBand="0" w:noVBand="1" w:val="04A0"/>
       </w:tblPr>
       <w:tblGrid>
-        <w:gridCol w:w="3249"/>
-        <w:gridCol w:w="3249"/>
-        <w:gridCol w:w="3249"/>
+        <w:gridCol w:w="2436"/>
+        <w:gridCol w:w="2436"/>
+        <w:gridCol w:w="2436"/>
+        <w:gridCol w:w="2436"/>
       </w:tblGrid>
       <w:tr>
         <w:tc>
           <w:tcPr>
-            <w:tcW w:type="dxa" w:w="3249"/>
+            <w:tcW w:type="dxa" w:w="2436"/>
           </w:tcPr>
           <w:p>
             <w:r>
@@ -72,7 +81,20 @@
         </w:tc>
         <w:tc>
           <w:tcPr>
-            <w:tcW w:type="dxa" w:w="3249"/>
+            <w:tcW w:type="dxa" w:w="2436"/>
+          </w:tcPr>
+          <w:p>
+            <w:r>
+              <w:rPr>
+                <w:b/>
+              </w:rPr>
+              <w:t>Who appears at the top today</w:t>
+            </w:r>
+          </w:p>
+        </w:tc>
+        <w:tc>
+          <w:tcPr>
+            <w:tcW w:type="dxa" w:w="2436"/>
           </w:tcPr>
           <w:p>
             <w:r>
@@ -85,7 +107,7 @@
         </w:tc>
         <w:tc>
           <w:tcPr>
-            <w:tcW w:type="dxa" w:w="3249"/>
+            <w:tcW w:type="dxa" w:w="2436"/>
           </w:tcPr>
           <w:p>
             <w:r>
@@ -100,7 +122,7 @@
       <w:tr>
         <w:tc>
           <w:tcPr>
-            <w:tcW w:type="dxa" w:w="3249"/>
+            <w:tcW w:type="dxa" w:w="2436"/>
           </w:tcPr>
           <w:p>
             <w:r>
@@ -110,7 +132,17 @@
         </w:tc>
         <w:tc>
           <w:tcPr>
-            <w:tcW w:type="dxa" w:w="3249"/>
+            <w:tcW w:type="dxa" w:w="2436"/>
+          </w:tcPr>
+          <w:p>
+            <w:r>
+              <w:t>Andreas Demetriades, GK Law Firm, Connor Legal, plus property agencies and guides</w:t>
+            </w:r>
+          </w:p>
+        </w:tc>
+        <w:tc>
+          <w:tcPr>
+            <w:tcW w:type="dxa" w:w="2436"/>
           </w:tcPr>
           <w:p>
             <w:r>
@@ -120,7 +152,7 @@
         </w:tc>
         <w:tc>
           <w:tcPr>
-            <w:tcW w:type="dxa" w:w="3249"/>
+            <w:tcW w:type="dxa" w:w="2436"/>
           </w:tcPr>
           <w:p>
             <w:r>
@@ -132,7 +164,7 @@
       <w:tr>
         <w:tc>
           <w:tcPr>
-            <w:tcW w:type="dxa" w:w="3249"/>
+            <w:tcW w:type="dxa" w:w="2436"/>
           </w:tcPr>
           <w:p>
             <w:r>
@@ -142,7 +174,17 @@
         </w:tc>
         <w:tc>
           <w:tcPr>
-            <w:tcW w:type="dxa" w:w="3249"/>
+            <w:tcW w:type="dxa" w:w="2436"/>
+          </w:tcPr>
+          <w:p>
+            <w:r>
+              <w:t>Several Cypriot firms in English; company-formation agencies in German; GK Law Firm and consultancies in Russian</w:t>
+            </w:r>
+          </w:p>
+        </w:tc>
+        <w:tc>
+          <w:tcPr>
+            <w:tcW w:type="dxa" w:w="2436"/>
           </w:tcPr>
           <w:p>
             <w:r>
@@ -152,7 +194,7 @@
         </w:tc>
         <w:tc>
           <w:tcPr>
-            <w:tcW w:type="dxa" w:w="3249"/>
+            <w:tcW w:type="dxa" w:w="2436"/>
           </w:tcPr>
           <w:p>
             <w:r>
@@ -164,7 +206,7 @@
       <w:tr>
         <w:tc>
           <w:tcPr>
-            <w:tcW w:type="dxa" w:w="3249"/>
+            <w:tcW w:type="dxa" w:w="2436"/>
           </w:tcPr>
           <w:p>
             <w:r>
@@ -174,7 +216,17 @@
         </w:tc>
         <w:tc>
           <w:tcPr>
-            <w:tcW w:type="dxa" w:w="3249"/>
+            <w:tcW w:type="dxa" w:w="2436"/>
+          </w:tcPr>
+          <w:p>
+            <w:r>
+              <w:t>Andreas Demetriades, GK Law Firm, Danos, Philippou, plus residency agencies</w:t>
+            </w:r>
+          </w:p>
+        </w:tc>
+        <w:tc>
+          <w:tcPr>
+            <w:tcW w:type="dxa" w:w="2436"/>
           </w:tcPr>
           <w:p>
             <w:r>
@@ -184,7 +236,7 @@
         </w:tc>
         <w:tc>
           <w:tcPr>
-            <w:tcW w:type="dxa" w:w="3249"/>
+            <w:tcW w:type="dxa" w:w="2436"/>
           </w:tcPr>
           <w:p>
             <w:r>
@@ -196,7 +248,7 @@
       <w:tr>
         <w:tc>
           <w:tcPr>
-            <w:tcW w:type="dxa" w:w="3249"/>
+            <w:tcW w:type="dxa" w:w="2436"/>
           </w:tcPr>
           <w:p>
             <w:r>
@@ -206,7 +258,17 @@
         </w:tc>
         <w:tc>
           <w:tcPr>
-            <w:tcW w:type="dxa" w:w="3249"/>
+            <w:tcW w:type="dxa" w:w="2436"/>
+          </w:tcPr>
+          <w:p>
+            <w:r>
+              <w:t>Michael Kyprianou, Connor Legal, Andreas Demetriades, Moudouros, plus Legal 500</w:t>
+            </w:r>
+          </w:p>
+        </w:tc>
+        <w:tc>
+          <w:tcPr>
+            <w:tcW w:type="dxa" w:w="2436"/>
           </w:tcPr>
           <w:p>
             <w:r>
@@ -216,7 +278,7 @@
         </w:tc>
         <w:tc>
           <w:tcPr>
-            <w:tcW w:type="dxa" w:w="3249"/>
+            <w:tcW w:type="dxa" w:w="2436"/>
           </w:tcPr>
           <w:p>
             <w:r>
@@ -228,7 +290,7 @@
       <w:tr>
         <w:tc>
           <w:tcPr>
-            <w:tcW w:type="dxa" w:w="3249"/>
+            <w:tcW w:type="dxa" w:w="2436"/>
           </w:tcPr>
           <w:p>
             <w:r>
@@ -238,7 +300,17 @@
         </w:tc>
         <w:tc>
           <w:tcPr>
-            <w:tcW w:type="dxa" w:w="3249"/>
+            <w:tcW w:type="dxa" w:w="2436"/>
+          </w:tcPr>
+          <w:p>
+            <w:r>
+              <w:t>Michael Kyprianou, Connor Legal, GK Law Firm, plus tax advisers</w:t>
+            </w:r>
+          </w:p>
+        </w:tc>
+        <w:tc>
+          <w:tcPr>
+            <w:tcW w:type="dxa" w:w="2436"/>
           </w:tcPr>
           <w:p>
             <w:r>
@@ -248,7 +320,7 @@
         </w:tc>
         <w:tc>
           <w:tcPr>
-            <w:tcW w:type="dxa" w:w="3249"/>
+            <w:tcW w:type="dxa" w:w="2436"/>
           </w:tcPr>
           <w:p>
             <w:r>
@@ -260,7 +332,7 @@
       <w:tr>
         <w:tc>
           <w:tcPr>
-            <w:tcW w:type="dxa" w:w="3249"/>
+            <w:tcW w:type="dxa" w:w="2436"/>
           </w:tcPr>
           <w:p>
             <w:r>
@@ -270,7 +342,17 @@
         </w:tc>
         <w:tc>
           <w:tcPr>
-            <w:tcW w:type="dxa" w:w="3249"/>
+            <w:tcW w:type="dxa" w:w="2436"/>
+          </w:tcPr>
+          <w:p>
+            <w:r>
+              <w:t>—</w:t>
+            </w:r>
+          </w:p>
+        </w:tc>
+        <w:tc>
+          <w:tcPr>
+            <w:tcW w:type="dxa" w:w="2436"/>
           </w:tcPr>
           <w:p>
             <w:r>
@@ -280,7 +362,7 @@
         </w:tc>
         <w:tc>
           <w:tcPr>
-            <w:tcW w:type="dxa" w:w="3249"/>
+            <w:tcW w:type="dxa" w:w="2436"/>
           </w:tcPr>
           <w:p>
             <w:r>
@@ -293,7 +375,12 @@
     <w:p/>
     <w:p>
       <w:r>
-        <w:t>When someone searches for one of these services, the website has no page that answers that search on its own.</w:t>
+        <w:t>The firms that appear again and again (Andreas Demetriades in 9 of the 15 searches, Michael Kyprianou and Connor Legal in 7, GK Law Firm in 6) all have one page per service in each language, for example a German page on banking law and a Russian page on Cyprus tax. When someone searches for one of these services, the Kalopetrides website has no page that answers that search on its own.</w:t>
+      </w:r>
+    </w:p>
+    <w:p>
+      <w:r>
+        <w:t>Our assessment: English searches from Cyprus are the hardest to break into, because many established firms and legal directories compete there. German searches are the most open: only a handful of law firms appear, next to agencies and portals. Russian searches sit in between, with several firms that already have well-developed Russian pages. In every language, the minimum requirement is a dedicated page per service in the language of the search.</w:t>
       </w:r>
     </w:p>
     <w:p>

</xml_diff>